<commit_message>
Add personalized submission Word documents and update remote
</commit_message>
<xml_diff>
--- a/YourName_RegNum_FGAI_Assignment2.docx
+++ b/YourName_RegNum_FGAI_Assignment2.docx
@@ -73,11 +73,9 @@
           <w:p>
             <w:r>
               <w:rPr>
-                <w:i/>
-                <w:color w:val="C00000"/>
                 <w:sz w:val="21"/>
               </w:rPr>
-              <w:t>[Enter Your Full Name Here]</w:t>
+              <w:t>Advay Naik</w:t>
             </w:r>
           </w:p>
         </w:tc>
@@ -105,11 +103,9 @@
           <w:p>
             <w:r>
               <w:rPr>
-                <w:i/>
-                <w:color w:val="C00000"/>
                 <w:sz w:val="21"/>
               </w:rPr>
-              <w:t>[Enter Your Registration Number Here]</w:t>
+              <w:t>230953322</w:t>
             </w:r>
           </w:p>
         </w:tc>
@@ -229,11 +225,9 @@
           <w:p>
             <w:r>
               <w:rPr>
-                <w:i/>
-                <w:color w:val="C00000"/>
                 <w:sz w:val="21"/>
               </w:rPr>
-              <w:t>https://github.com/[YourUsername]/ICT4403_Assignment2_TextGeneration</w:t>
+              <w:t>https://github.com/advaynaik99-droid/fgai230953322</w:t>
             </w:r>
           </w:p>
         </w:tc>

</xml_diff>